<commit_message>
court(njsupct): amicus letter brief gated on all three engines (fb-595.54.72)
Co-Authored-By: Claude Opus 5.5 <noreply@anthropic.com>
</commit_message>
<xml_diff>
--- a/courts/third-circuit/new-jersey/state/supreme-court/amicus-brief/usage/OUTPUT-amicus-brief.docx
+++ b/courts/third-circuit/new-jersey/state/supreme-court/amicus-brief/usage/OUTPUT-amicus-brief.docx
@@ -175,7 +175,7 @@
           <w:sz w:val="24"/>
           <w:szCs w:val="24"/>
         </w:rPr>
-        <w:t xml:space="preserve">www.aclu-nj.org</w:t>
+        <w:t xml:space="preserve">www.​aclu-​nj.​org</w:t>
       </w:r>
     </w:p>
     <w:p>
@@ -2260,7 +2260,7 @@
         <w:pStyle w:val="BodyText"/>
       </w:pPr>
       <w:r>
-        <w:t xml:space="preserve">Here, the Appellate Division surmised that the prosecutor’s reference to The Wire in her opening was “to reasonably introduce [the jurors] to the concept of a wiretap, which was at the core of the State’s case [,] . . . to explain that ‘sometimes the targets tell on themselves’ and that the jurors ‘should focus on what defendant’ is . . . telling you what about what he’s doing.’ ” (Dpa 21). Even were that so, there was no reason for the prosecutor to resort to a popular culture and fictional reference, with all the potential for extra-evidence implications inherent in such reference, in order to explain these simple and self-evident concepts.</w:t>
+        <w:t xml:space="preserve">Here, the Appellate Division surmised that the prosecutor’s reference to The Wire in her opening was “to reasonably introduce [the jurors] to the concept of a wiretap, which was at the core of the State’s case [,] . . . to explain that ‘sometimes the targets tell on themselves’ and that the jurors ‘should focus on what defendant’ is . . . telling you what about what he’s doing.’ ” (Dpa 21). Even were that so, there was no reason for the prosecutor to resort to a popular culture and fictional reference, with all the potential for extra-evidence implications inherent in such reference, in order to explain these simple and self-evident concepts.</w:t>
       </w:r>
       <w:r>
         <w:t xml:space="preserve"> </w:t>
@@ -2289,7 +2289,7 @@
         <w:pStyle w:val="BodyText"/>
       </w:pPr>
       <w:r>
-        <w:t xml:space="preserve">The complete opening statement of the prosecutor belies even that limited, but suspect, purpose. The prosecutor placed her discussion of The Wire within a larger context of gang crime, with Mr. Butler at its epicenter. This was not, in the prosecutor’s telling, a case merely about whether the defendant possessed a gun and possessed or sold drugs. Indeed, it was not simply a case about guns or drugs, the prosecutor told the jury in the very beginning of her opening: “. . . [I]t’s a little bigger than that, because all those guns and drugs go together.” (4T 18</w:t>
+        <w:t xml:space="preserve">The complete opening statement of the prosecutor belies even that limited, but suspect, purpose. The prosecutor placed her discussion of The Wire within a larger context of gang crime, with Mr. Butler at its epicenter. This was not, in the prosecutor’s telling, a case merely about whether the defendant possessed a gun and possessed or sold drugs. Indeed, it was not simply a case about guns or drugs, the prosecutor told the jury in the very beginning of her opening: “. . . [I]t’s a little bigger than that, because all those guns and drugs go together.” (4T 18</w:t>
       </w:r>
       <w:r>
         <w:noBreakHyphen/>
@@ -2347,7 +2347,7 @@
         <w:pStyle w:val="BodyText"/>
       </w:pPr>
       <w:r>
-        <w:t xml:space="preserve">Maybe the prosecutor did make these statements for the innocent reasons ascribed to her by the Appellate Division. Even if the prosecutor acts in good faith in making an improper statement, however, the defendant “should not bear the consequences of the prosecutor’s poor judgment . . . .”</w:t>
+        <w:t xml:space="preserve">Maybe the prosecutor did make these statements for the innocent reasons ascribed to her by the Appellate Division. Even if the prosecutor acts in good faith in making an improper statement, however, the defendant “should not bear the consequences of the prosecutor’s poor judgment . . . .”</w:t>
       </w:r>
       <w:r>
         <w:t xml:space="preserve"> </w:t>
@@ -2536,7 +2536,7 @@
         <w:pStyle w:val="BodyText"/>
       </w:pPr>
       <w:r>
-        <w:t xml:space="preserve">Because of this prejudice, reversal of Mr. Butler’s conviction is required. It is “enough that the opening statement could have contributed to the verdict to warrant a new trial where . . . the evidence of guilt was far from overwhelming.”</w:t>
+        <w:t xml:space="preserve">Because of this prejudice, reversal of Mr. Butler’s conviction is required. It is “enough that the opening statement could have contributed to the verdict to warrant a new trial where . . . the evidence of guilt was far from overwhelming.”</w:t>
       </w:r>
       <w:r>
         <w:t xml:space="preserve"> </w:t>
@@ -3413,7 +3413,7 @@
         <w:t xml:space="preserve"> </w:t>
       </w:r>
       <w:r>
-        <w:t xml:space="preserve">The Wire has been named one of the best television shows of all time by Time magazine (2007), TV Guide (2013), Entertainment Weekly (2013), and Rolling Stone (2016). Wikipedia, The Wire, https://​​en.​wikipedia.​org/​​wiki/​​The_Wire (last visited June 6, 2025). Although, when it first aired on HBO between 2002 and 2008, it “received only average ratings. . . .,”</w:t>
+        <w:t xml:space="preserve">The Wire has been named one of the best television shows of all time by Time magazine (2007), TV Guide (2013), Entertainment Weekly (2013), and Rolling Stone (2016). Wikipedia, The Wire, https://​en.​wikipedia.​org/​wiki/​The_Wire (last visited June 6, 2025). Although, when it first aired on HBO between 2002 and 2008, it “received only average ratings. . . .,”</w:t>
       </w:r>
       <w:r>
         <w:t xml:space="preserve"> </w:t>
@@ -3439,7 +3439,7 @@
         <w:t xml:space="preserve">Why The Wire’s Ratings Were So Low (Despite Being So Popular)</w:t>
       </w:r>
       <w:r>
-        <w:t xml:space="preserve">, Screenrant (Mar. 7, 2023), https://​​screenrant.​com/​​why-​the-​wire-​viewership-​low-​popular/​​. After its initial run on HBO, BET aired the show, and, beginning in 2014, a remastered version was shown on HBO Signature and HBO GO, continuing to this day on Max, and the entire series was released on DVD beginning in 2004. Wikipedia, The Wire, https://​​en.​wikipedia.​org/​​wiki/​​The_Wire (last visited June 6, 2025). During the beginning of the pandemic, HBO’s parent company, WarnerMedia, reported that viewership of The Wire had tripled on its streaming service. Yohana Desta,</w:t>
+        <w:t xml:space="preserve">, Screenrant (Mar. 7, 2023), https://​screenrant.​com/​why-​the-​wire-​viewership-​low-​popular/​. After its initial run on HBO, BET aired the show, and, beginning in 2014, a remastered version was shown on HBO Signature and HBO GO, continuing to this day on Max, and the entire series was released on DVD beginning in 2004. Wikipedia, The Wire, https://​en.​wikipedia.​org/​wiki/​The_Wire (last visited June 6, 2025). During the beginning of the pandemic, HBO’s parent company, WarnerMedia, reported that viewership of The Wire had tripled on its streaming service. Yohana Desta,</w:t>
       </w:r>
       <w:r>
         <w:t xml:space="preserve"> </w:t>
@@ -3452,7 +3452,7 @@
         <w:t xml:space="preserve">Coronavirus Hits, and Finally Everyone Is Watching The Wire</w:t>
       </w:r>
       <w:r>
-        <w:t xml:space="preserve">, Vanity Fair (Mar. 25, 2020), https://​​www.​vanityfair.​com/​​hollywood/​​2020/​​03/​​coronavirus-​the-​wire-​hbo?srslttid=AfmBOopW5C_YX1eK1z6wq0410cl1ozwBrNGoz5CltjrRmpWhL9phlJrz. One analyst has estimated that the audience demand for The Wire is 23.7 times the demand of the average TV series in the United States over the last 30 days. Only 2.7% of all shows in this market have this level of demand. Parrot Analytics,</w:t>
+        <w:t xml:space="preserve">, Vanity Fair (Mar. 25, 2020), https://​www.​vanityfair.​com/​hollywood/​2020/​03/​coronavirus-​the-​wire-​hbo?​srslttid=AfmBOopW5C_YX1eK1z6wq0410cl1ozwBrNGoz5CltjrRmpWhL9phlJrz. One analyst has estimated that the audience demand for The Wire is 23.7 times the demand of the average TV series in the United States over the last 30 days. Only 2.7% of all shows in this market have this level of demand. Parrot Analytics,</w:t>
       </w:r>
       <w:r>
         <w:t xml:space="preserve"> </w:t>
@@ -3465,7 +3465,7 @@
         <w:t xml:space="preserve">United States Entertainment Analytics for The Wire</w:t>
       </w:r>
       <w:r>
-        <w:t xml:space="preserve">, https://​​tv.​parrotanalytics.​com/​​US/​​the-​wire-​hbo (last visited June 6, 2025).</w:t>
+        <w:t xml:space="preserve">, https://​tv.​parrotanalytics.​com/​US/​the-​wire-​hbo (last visited June 6, 2025).</w:t>
       </w:r>
     </w:p>
   </w:footnote>
@@ -4477,6 +4477,33 @@
     <w:pPr>
       <w:spacing w:before="0" w:after="0" w:line="322" w:lineRule="exact"/>
       <w:ind w:left="2160" w:hanging="720"/>
+    </w:pPr>
+  </w:style>
+  <w:style w:type="paragraph" w:customStyle="1" w:styleId="XdQuoteList1">
+    <w:name w:val="Xd Quote List 1"/>
+    <w:basedOn w:val="Normal"/>
+    <w:qFormat/>
+    <w:pPr>
+      <w:spacing w:before="0" w:after="0" w:line="322" w:lineRule="exact"/>
+      <w:ind w:left="2160" w:right="1440" w:hanging="720"/>
+    </w:pPr>
+  </w:style>
+  <w:style w:type="paragraph" w:customStyle="1" w:styleId="XdQuoteList2">
+    <w:name w:val="Xd Quote List 2"/>
+    <w:basedOn w:val="Normal"/>
+    <w:qFormat/>
+    <w:pPr>
+      <w:spacing w:before="0" w:after="0" w:line="322" w:lineRule="exact"/>
+      <w:ind w:left="2880" w:right="1440" w:hanging="720"/>
+    </w:pPr>
+  </w:style>
+  <w:style w:type="paragraph" w:customStyle="1" w:styleId="XdQuoteList3">
+    <w:name w:val="Xd Quote List 3"/>
+    <w:basedOn w:val="Normal"/>
+    <w:qFormat/>
+    <w:pPr>
+      <w:spacing w:before="0" w:after="0" w:line="322" w:lineRule="exact"/>
+      <w:ind w:left="3600" w:right="1440" w:hanging="720"/>
     </w:pPr>
   </w:style>
   <w:style w:type="paragraph" w:customStyle="1" w:styleId="XdQuoteFirst">

</xml_diff>